<commit_message>
docs: minor adjustments to GUIDE_Rubric_Document.docx
</commit_message>
<xml_diff>
--- a/GUIDE_Rubric_Document.docx
+++ b/GUIDE_Rubric_Document.docx
@@ -545,6 +545,7 @@
           <w:sz w:val="20"/>
           <w:szCs w:val="20"/>
         </w:rPr>
+        <w:lastRenderedPageBreak/>
         <w:br w:type="page"/>
       </w:r>
     </w:p>
@@ -558,131 +559,94 @@
           <w:szCs w:val="34"/>
         </w:rPr>
       </w:pPr>
-      <w:proofErr w:type="gramStart"/>
       <w:r>
         <w:rPr>
           <w:color w:val="2E6EA6"/>
           <w:sz w:val="34"/>
           <w:szCs w:val="34"/>
         </w:rPr>
+        <w:lastRenderedPageBreak/>
         <w:t>Quality Outcomes: Effective, Efficient, Engaging</w:t>
       </w:r>
-      <w:proofErr w:type="gramEnd"/>
-      <w:proofErr w:type="gramStart"/>
-      <w:proofErr w:type="gramEnd"/>
-    </w:p>
-    <w:p>
-      <w:pPr>
-        <w:spacing w:before="240" w:after="120" w:line="319" w:lineRule="auto"/>
-        <w:jc w:val="center"/>
+    </w:p>
+    <w:p>
+      <w:r>
+        <w:t>High-quality instruction is effective, efficient, and engaging (Merrill, 2002). Hirumi (2025), building on Hirumi, Ratliff &amp; de la Mora (2021), maps each of those quality outcomes to an alignment of instructional elements. GUIDE operationalizes each.</w:t>
+      </w:r>
+    </w:p>
+    <w:p/>
+    <w:p>
+      <w:pPr>
+        <w:pStyle w:val="ListParagraph"/>
+        <w:numPr>
+          <w:ilvl w:val="0"/>
+          <w:numId w:val="2"/>
+        </w:numPr>
+      </w:pPr>
+      <w:r>
         <w:rPr>
           <w:b/>
           <w:bCs/>
-          <w:color w:val="1B3A5C"/>
-          <w:sz w:val="48"/>
-          <w:szCs w:val="48"/>
-        </w:rPr>
+        </w:rPr>
+        <w:t>Effective</w:t>
+      </w:r>
+      <w:r>
+        <w:t xml:space="preserve"> - instructional elements aligned with theory, research, and documented best practice (Hannafin, Hannafin, Land, &amp; Oliver, 1997). Whether the artifact reflects what learning science </w:t>
+      </w:r>
+      <w:r>
+        <w:t>says</w:t>
+      </w:r>
+      <w:r>
+        <w:t xml:space="preserve"> works. This is </w:t>
+      </w:r>
+      <w:r>
+        <w:t>grounded</w:t>
+      </w:r>
+      <w:r>
+        <w:t xml:space="preserve"> in Grounded Universal Instructional Design Evaluator.</w:t>
+      </w:r>
+    </w:p>
+    <w:p>
+      <w:pPr>
+        <w:pStyle w:val="ListParagraph"/>
+        <w:numPr>
+          <w:ilvl w:val="0"/>
+          <w:numId w:val="2"/>
+        </w:numPr>
       </w:pPr>
       <w:r>
         <w:rPr>
           <w:b/>
           <w:bCs/>
-          <w:color w:val="1B3A5C"/>
-          <w:sz w:val="48"/>
-          <w:szCs w:val="48"/>
-        </w:rPr>
-        <w:t>High-quality instruction is effective, efficient, and engaging (Merrill, 2002). Hirumi (2025), building on Hirumi, Ratliff &amp; de la Mora (2021), maps each of those quality outcomes to an alignment of instructional elements. GUIDE operationalizes each.</w:t>
-      </w:r>
-    </w:p>
-    <w:p>
-      <w:pPr>
-        <w:spacing w:before="240" w:after="120" w:line="319" w:lineRule="auto"/>
-        <w:jc w:val="center"/>
+        </w:rPr>
+        <w:t xml:space="preserve">Efficient </w:t>
+      </w:r>
+      <w:r>
+        <w:t>- objectives, instructional strategies (chunking and sequencing), and learner assessments aligned with each other (Tyler, 1949; Bloom, 1956; Dick, Carey &amp; Carey, 2015). Whether the artifact's internal pieces cohere so learners are not doing wasted work. Archetype 10 (Curriculum Alignment) operationalizes this alignment as a dedicated evaluation lens.</w:t>
+      </w:r>
+    </w:p>
+    <w:p>
+      <w:pPr>
+        <w:pStyle w:val="ListParagraph"/>
+        <w:numPr>
+          <w:ilvl w:val="0"/>
+          <w:numId w:val="2"/>
+        </w:numPr>
+      </w:pPr>
+      <w:r>
         <w:rPr>
           <w:b/>
           <w:bCs/>
-          <w:color w:val="1B3A5C"/>
-          <w:sz w:val="48"/>
-          <w:szCs w:val="48"/>
-        </w:rPr>
-      </w:pPr>
-      <w:r>
-        <w:rPr>
-          <w:b/>
-          <w:bCs/>
-          <w:color w:val="1B3A5C"/>
-          <w:sz w:val="48"/>
-          <w:szCs w:val="48"/>
-        </w:rPr>
-        <w:t>Effective - instructional elements aligned with theory, research, and documented best practice (Hannafin, Hannafin, Land, &amp; Oliver, 1997). Whether the artifact reflects what learning science actually says works. This is the grounded in Grounded Universal Instructional Design Evaluator.</w:t>
-      </w:r>
-    </w:p>
-    <w:p>
-      <w:pPr>
-        <w:spacing w:before="240" w:after="120" w:line="319" w:lineRule="auto"/>
-        <w:jc w:val="center"/>
-        <w:rPr>
-          <w:b/>
-          <w:bCs/>
-          <w:color w:val="1B3A5C"/>
-          <w:sz w:val="48"/>
-          <w:szCs w:val="48"/>
-        </w:rPr>
-      </w:pPr>
-      <w:r>
-        <w:rPr>
-          <w:b/>
-          <w:bCs/>
-          <w:color w:val="1B3A5C"/>
-          <w:sz w:val="48"/>
-          <w:szCs w:val="48"/>
-        </w:rPr>
-        <w:t>Efficient - objectives, instructional strategies (chunking and sequencing), and learner assessments aligned with each other (Tyler, 1949; Bloom, 1956; Dick, Carey &amp; Carey, 2015). Whether the artifact's internal pieces cohere so learners are not doing wasted work. Archetype 10 (Curriculum Alignment) operationalizes this alignment as a dedicated evaluation lens.</w:t>
-      </w:r>
-    </w:p>
-    <w:p>
-      <w:pPr>
-        <w:spacing w:before="240" w:after="120" w:line="319" w:lineRule="auto"/>
-        <w:jc w:val="center"/>
-        <w:rPr>
-          <w:b/>
-          <w:bCs/>
-          <w:color w:val="1B3A5C"/>
-          <w:sz w:val="48"/>
-          <w:szCs w:val="48"/>
-        </w:rPr>
-      </w:pPr>
-      <w:r>
-        <w:rPr>
-          <w:b/>
-          <w:bCs/>
-          <w:color w:val="1B3A5C"/>
-          <w:sz w:val="48"/>
-          <w:szCs w:val="48"/>
-        </w:rPr>
-        <w:t>Engaging - instructional elements aligned with learners' personal and professional goals, interests, and motivations (Keller, 1987, 2010 - ARCS). Whether the artifact connects to who the learner is and what they are trying to become. ARCS is operationalized as a capture requirement in Archetype 07 Level 4 (Learner Needs) and as a cross-cutting motivational design layer in Archetype 03 (Learning Domain Alignment).</w:t>
-      </w:r>
-    </w:p>
-    <w:p>
-      <w:pPr>
-        <w:spacing w:before="240" w:after="120" w:line="319" w:lineRule="auto"/>
-        <w:jc w:val="center"/>
-        <w:rPr>
-          <w:b/>
-          <w:bCs/>
-          <w:color w:val="1B3A5C"/>
-          <w:sz w:val="48"/>
-          <w:szCs w:val="48"/>
-        </w:rPr>
-      </w:pPr>
-      <w:r>
-        <w:rPr>
-          <w:b/>
-          <w:bCs/>
-          <w:color w:val="1B3A5C"/>
-          <w:sz w:val="48"/>
-          <w:szCs w:val="48"/>
-        </w:rPr>
+        </w:rPr>
+        <w:t xml:space="preserve">Engaging </w:t>
+      </w:r>
+      <w:r>
+        <w:t>- instructional elements aligned with learners' personal and professional goals, interests, and motivations (Keller, 1987, 2010 - ARCS). Whether the artifact connects to who the learner is and what they are trying to become. ARCS is operationalized as a capture requirement in Archetype 07 Level 4 (Learner Needs) and as a cross-cutting motivational design layer in Archetype 03 (Learning Domain Alignment).</w:t>
+      </w:r>
+    </w:p>
+    <w:p/>
+    <w:p>
+      <w:r>
         <w:t>Each archetype below evaluates one or more of these three alignments. Archetypes 01-09 evaluate component quality across the ADDIE lifecycle; Archetype 10 is the synthesis archetype that evaluates internal coherence between objectives, instruction, and assessment.</w:t>
       </w:r>
     </w:p>
@@ -703,7 +667,6 @@
           <w:sz w:val="34"/>
           <w:szCs w:val="34"/>
         </w:rPr>
-        <w:lastRenderedPageBreak/>
         <w:t>Quick-Reference</w:t>
       </w:r>
       <w:proofErr w:type="gramEnd"/>
@@ -1039,6 +1002,7 @@
                 <w:sz w:val="18"/>
                 <w:szCs w:val="18"/>
               </w:rPr>
+              <w:lastRenderedPageBreak/>
               <w:t>03 - Instructional Sequencing</w:t>
             </w:r>
           </w:p>
@@ -1517,7 +1481,6 @@
                 <w:sz w:val="18"/>
                 <w:szCs w:val="18"/>
               </w:rPr>
-              <w:lastRenderedPageBreak/>
               <w:t>09 - Cognitive Neuroscience</w:t>
             </w:r>
           </w:p>
@@ -1579,7 +1542,21 @@
             </w:tcMar>
           </w:tcPr>
           <w:p>
-            <w:r>
+            <w:pPr>
+              <w:rPr>
+                <w:b/>
+                <w:bCs/>
+                <w:sz w:val="18"/>
+                <w:szCs w:val="18"/>
+              </w:rPr>
+            </w:pPr>
+            <w:r>
+              <w:rPr>
+                <w:b/>
+                <w:bCs/>
+                <w:sz w:val="18"/>
+                <w:szCs w:val="18"/>
+              </w:rPr>
               <w:t>10 - Curriculum Alignment</w:t>
             </w:r>
           </w:p>
@@ -1602,7 +1579,17 @@
             </w:tcMar>
           </w:tcPr>
           <w:p>
-            <w:r>
+            <w:pPr>
+              <w:rPr>
+                <w:sz w:val="18"/>
+                <w:szCs w:val="18"/>
+              </w:rPr>
+            </w:pPr>
+            <w:r>
+              <w:rPr>
+                <w:sz w:val="18"/>
+                <w:szCs w:val="18"/>
+              </w:rPr>
               <w:t>Objective &lt;-&gt; Strategy Coherence, Strategy &lt;-&gt; Assessment Coherence, Objective &lt;-&gt; Assessment Coherence, Coverage Completeness, Vertical Alignment, Discipline Alignment</w:t>
             </w:r>
           </w:p>
@@ -5348,23 +5335,21 @@
           <w:sz w:val="20"/>
           <w:szCs w:val="20"/>
         </w:rPr>
-        <w:t xml:space="preserve">GUIDE is a modular suite of nine evaluation archetypes built on a shared infrastructure (guide_base.py) with a central registry (guide_registry.py). Each archetype defines its own judge system prompt and human prompt template; the shared infrastructure provides the machinery to execute them individually, in composite, or as a full suite. The framework synthesizes </w:t>
-      </w:r>
-      <w:proofErr w:type="gramStart"/>
-      <w:r>
-        <w:rPr>
-          <w:sz w:val="20"/>
-          <w:szCs w:val="20"/>
-        </w:rPr>
-        <w:t>principle</w:t>
-      </w:r>
-      <w:proofErr w:type="gramEnd"/>
-      <w:r>
-        <w:rPr>
-          <w:sz w:val="20"/>
-          <w:szCs w:val="20"/>
-        </w:rPr>
-        <w:t xml:space="preserve"> sets from peer-reviewed instructional design research, each grounded in source materials from the UCF Master of Arts in Instructional Systems program.</w:t>
+        <w:t xml:space="preserve">GUIDE is a modular suite of </w:t>
+      </w:r>
+      <w:r>
+        <w:rPr>
+          <w:sz w:val="20"/>
+          <w:szCs w:val="20"/>
+        </w:rPr>
+        <w:t>ten</w:t>
+      </w:r>
+      <w:r>
+        <w:rPr>
+          <w:sz w:val="20"/>
+          <w:szCs w:val="20"/>
+        </w:rPr>
+        <w:t xml:space="preserve"> evaluation archetypes built on a shared infrastructure (guide_base.py) with a central registry (guide_registry.py). Each archetype defines its own judge system prompt and human prompt template; the shared infrastructure provides the machinery to execute them individually, in composite, or as a full suite. The framework synthesizes peer-reviewed instructional design research, grounded in source materials from the UCF Master of Arts in Instructional Systems program.</w:t>
       </w:r>
     </w:p>
     <w:p>
@@ -5403,15 +5388,13 @@
         </w:rPr>
         <w:t xml:space="preserve">The following terms appear throughout this document. </w:t>
       </w:r>
-      <w:proofErr w:type="gramStart"/>
-      <w:r>
-        <w:rPr>
-          <w:sz w:val="20"/>
-          <w:szCs w:val="20"/>
-        </w:rPr>
-        <w:t>Refer back</w:t>
-      </w:r>
-      <w:proofErr w:type="gramEnd"/>
+      <w:r>
+        <w:rPr>
+          <w:sz w:val="20"/>
+          <w:szCs w:val="20"/>
+        </w:rPr>
+        <w:t>Refer</w:t>
+      </w:r>
       <w:r>
         <w:rPr>
           <w:sz w:val="20"/>
@@ -9336,7 +9319,6 @@
           <w:sz w:val="20"/>
           <w:szCs w:val="20"/>
         </w:rPr>
-        <w:lastRenderedPageBreak/>
         <w:t xml:space="preserve"> </w:t>
       </w:r>
     </w:p>
@@ -9415,23 +9397,7 @@
                 <w:sz w:val="20"/>
                 <w:szCs w:val="20"/>
               </w:rPr>
-              <w:t xml:space="preserve">Before scoring your own artifacts, ask yourself: would I have scored Dimension 3 a 3 or a 4? If </w:t>
-            </w:r>
-            <w:proofErr w:type="gramStart"/>
-            <w:r>
-              <w:rPr>
-                <w:sz w:val="20"/>
-                <w:szCs w:val="20"/>
-              </w:rPr>
-              <w:t>you would have</w:t>
-            </w:r>
-            <w:proofErr w:type="gramEnd"/>
-            <w:r>
-              <w:rPr>
-                <w:sz w:val="20"/>
-                <w:szCs w:val="20"/>
-              </w:rPr>
-              <w:t xml:space="preserve"> </w:t>
+              <w:t xml:space="preserve">Before scoring your own artifacts, ask yourself: would I have scored Dimension 3 a 3 or a 4? If you would have </w:t>
             </w:r>
             <w:proofErr w:type="gramStart"/>
             <w:r>
@@ -9607,8 +9573,6 @@
           <w:szCs w:val="26"/>
         </w:rPr>
       </w:pPr>
-      <w:bookmarkStart w:id="13" w:name="_fp7fl0fj6nni" w:colFirst="0" w:colLast="0"/>
-      <w:bookmarkEnd w:id="13"/>
       <w:r>
         <w:rPr>
           <w:color w:val="3A3A3A"/>
@@ -10361,8 +10325,8 @@
           <w:szCs w:val="26"/>
         </w:rPr>
       </w:pPr>
-      <w:bookmarkStart w:id="14" w:name="_wyzo9u83yqo1" w:colFirst="0" w:colLast="0"/>
-      <w:bookmarkEnd w:id="14"/>
+      <w:bookmarkStart w:id="13" w:name="_wyzo9u83yqo1" w:colFirst="0" w:colLast="0"/>
+      <w:bookmarkEnd w:id="13"/>
     </w:p>
     <w:p>
       <w:pPr>
@@ -10374,8 +10338,8 @@
           <w:szCs w:val="26"/>
         </w:rPr>
       </w:pPr>
-      <w:bookmarkStart w:id="15" w:name="_ilnhp9mbncjk" w:colFirst="0" w:colLast="0"/>
-      <w:bookmarkEnd w:id="15"/>
+      <w:bookmarkStart w:id="14" w:name="_ilnhp9mbncjk" w:colFirst="0" w:colLast="0"/>
+      <w:bookmarkEnd w:id="14"/>
       <w:r>
         <w:rPr>
           <w:color w:val="3A3A3A"/>
@@ -11112,8 +11076,8 @@
           <w:szCs w:val="26"/>
         </w:rPr>
       </w:pPr>
-      <w:bookmarkStart w:id="16" w:name="_o8fvvfbdrtuo" w:colFirst="0" w:colLast="0"/>
-      <w:bookmarkEnd w:id="16"/>
+      <w:bookmarkStart w:id="15" w:name="_o8fvvfbdrtuo" w:colFirst="0" w:colLast="0"/>
+      <w:bookmarkEnd w:id="15"/>
       <w:r>
         <w:rPr>
           <w:color w:val="3A3A3A"/>
@@ -11883,8 +11847,8 @@
           <w:szCs w:val="26"/>
         </w:rPr>
       </w:pPr>
-      <w:bookmarkStart w:id="17" w:name="_ogxnlghl0nl" w:colFirst="0" w:colLast="0"/>
-      <w:bookmarkEnd w:id="17"/>
+      <w:bookmarkStart w:id="16" w:name="_ogxnlghl0nl" w:colFirst="0" w:colLast="0"/>
+      <w:bookmarkEnd w:id="16"/>
       <w:r>
         <w:rPr>
           <w:color w:val="3A3A3A"/>
@@ -12641,8 +12605,8 @@
           <w:szCs w:val="26"/>
         </w:rPr>
       </w:pPr>
-      <w:bookmarkStart w:id="18" w:name="_ah8pvh5y5j3j" w:colFirst="0" w:colLast="0"/>
-      <w:bookmarkEnd w:id="18"/>
+      <w:bookmarkStart w:id="17" w:name="_ah8pvh5y5j3j" w:colFirst="0" w:colLast="0"/>
+      <w:bookmarkEnd w:id="17"/>
       <w:r>
         <w:rPr>
           <w:color w:val="3A3A3A"/>
@@ -13384,8 +13348,8 @@
           <w:szCs w:val="26"/>
         </w:rPr>
       </w:pPr>
-      <w:bookmarkStart w:id="19" w:name="_sfu34musvf06" w:colFirst="0" w:colLast="0"/>
-      <w:bookmarkEnd w:id="19"/>
+      <w:bookmarkStart w:id="18" w:name="_sfu34musvf06" w:colFirst="0" w:colLast="0"/>
+      <w:bookmarkEnd w:id="18"/>
       <w:r>
         <w:rPr>
           <w:color w:val="3A3A3A"/>
@@ -14147,8 +14111,8 @@
           <w:szCs w:val="46"/>
         </w:rPr>
       </w:pPr>
-      <w:bookmarkStart w:id="20" w:name="_59m0n9gkzi8z" w:colFirst="0" w:colLast="0"/>
-      <w:bookmarkEnd w:id="20"/>
+      <w:bookmarkStart w:id="19" w:name="_59m0n9gkzi8z" w:colFirst="0" w:colLast="0"/>
+      <w:bookmarkEnd w:id="19"/>
       <w:r>
         <w:rPr>
           <w:color w:val="1B3A5C"/>
@@ -14282,8 +14246,8 @@
           <w:szCs w:val="26"/>
         </w:rPr>
       </w:pPr>
-      <w:bookmarkStart w:id="21" w:name="_59qzi59lq433" w:colFirst="0" w:colLast="0"/>
-      <w:bookmarkEnd w:id="21"/>
+      <w:bookmarkStart w:id="20" w:name="_59qzi59lq433" w:colFirst="0" w:colLast="0"/>
+      <w:bookmarkEnd w:id="20"/>
       <w:r>
         <w:rPr>
           <w:color w:val="3A3A3A"/>
@@ -14928,8 +14892,8 @@
           <w:szCs w:val="26"/>
         </w:rPr>
       </w:pPr>
-      <w:bookmarkStart w:id="22" w:name="_w751kcv8dfah" w:colFirst="0" w:colLast="0"/>
-      <w:bookmarkEnd w:id="22"/>
+      <w:bookmarkStart w:id="21" w:name="_w751kcv8dfah" w:colFirst="0" w:colLast="0"/>
+      <w:bookmarkEnd w:id="21"/>
       <w:r>
         <w:rPr>
           <w:color w:val="3A3A3A"/>
@@ -15359,23 +15323,7 @@
                 <w:sz w:val="20"/>
                 <w:szCs w:val="20"/>
               </w:rPr>
-              <w:t xml:space="preserve">Well-defined </w:t>
-            </w:r>
-            <w:proofErr w:type="gramStart"/>
-            <w:r>
-              <w:rPr>
-                <w:sz w:val="20"/>
-                <w:szCs w:val="20"/>
-              </w:rPr>
-              <w:t>objectives;</w:t>
-            </w:r>
-            <w:proofErr w:type="gramEnd"/>
-            <w:r>
-              <w:rPr>
-                <w:sz w:val="20"/>
-                <w:szCs w:val="20"/>
-              </w:rPr>
-              <w:t xml:space="preserve"> most items align; 1-2 tangential.</w:t>
+              <w:t>Well-defined objectives; most items align; 1-2 tangential.</w:t>
             </w:r>
           </w:p>
         </w:tc>
@@ -15642,8 +15590,8 @@
           <w:szCs w:val="26"/>
         </w:rPr>
       </w:pPr>
-      <w:bookmarkStart w:id="23" w:name="_iowl7akrj1q1" w:colFirst="0" w:colLast="0"/>
-      <w:bookmarkEnd w:id="23"/>
+      <w:bookmarkStart w:id="22" w:name="_iowl7akrj1q1" w:colFirst="0" w:colLast="0"/>
+      <w:bookmarkEnd w:id="22"/>
       <w:r>
         <w:rPr>
           <w:color w:val="3A3A3A"/>
@@ -16287,8 +16235,8 @@
           <w:szCs w:val="26"/>
         </w:rPr>
       </w:pPr>
-      <w:bookmarkStart w:id="24" w:name="_dog0hwirs0kp" w:colFirst="0" w:colLast="0"/>
-      <w:bookmarkEnd w:id="24"/>
+      <w:bookmarkStart w:id="23" w:name="_dog0hwirs0kp" w:colFirst="0" w:colLast="0"/>
+      <w:bookmarkEnd w:id="23"/>
       <w:r>
         <w:rPr>
           <w:color w:val="3A3A3A"/>
@@ -16882,8 +16830,8 @@
           <w:szCs w:val="26"/>
         </w:rPr>
       </w:pPr>
-      <w:bookmarkStart w:id="25" w:name="_sqnr629n4elz" w:colFirst="0" w:colLast="0"/>
-      <w:bookmarkEnd w:id="25"/>
+      <w:bookmarkStart w:id="24" w:name="_sqnr629n4elz" w:colFirst="0" w:colLast="0"/>
+      <w:bookmarkEnd w:id="24"/>
       <w:r>
         <w:rPr>
           <w:color w:val="3A3A3A"/>
@@ -17486,8 +17434,8 @@
           <w:szCs w:val="26"/>
         </w:rPr>
       </w:pPr>
-      <w:bookmarkStart w:id="26" w:name="_wjvsaqn5v88h" w:colFirst="0" w:colLast="0"/>
-      <w:bookmarkEnd w:id="26"/>
+      <w:bookmarkStart w:id="25" w:name="_wjvsaqn5v88h" w:colFirst="0" w:colLast="0"/>
+      <w:bookmarkEnd w:id="25"/>
       <w:r>
         <w:rPr>
           <w:color w:val="3A3A3A"/>
@@ -18115,8 +18063,8 @@
           <w:szCs w:val="46"/>
         </w:rPr>
       </w:pPr>
-      <w:bookmarkStart w:id="27" w:name="_dq249agagspn" w:colFirst="0" w:colLast="0"/>
-      <w:bookmarkEnd w:id="27"/>
+      <w:bookmarkStart w:id="26" w:name="_dq249agagspn" w:colFirst="0" w:colLast="0"/>
+      <w:bookmarkEnd w:id="26"/>
       <w:r>
         <w:rPr>
           <w:color w:val="1B3A5C"/>
@@ -18266,8 +18214,8 @@
           <w:szCs w:val="26"/>
         </w:rPr>
       </w:pPr>
-      <w:bookmarkStart w:id="28" w:name="_393m5n8zszsi" w:colFirst="0" w:colLast="0"/>
-      <w:bookmarkEnd w:id="28"/>
+      <w:bookmarkStart w:id="27" w:name="_393m5n8zszsi" w:colFirst="0" w:colLast="0"/>
+      <w:bookmarkEnd w:id="27"/>
       <w:r>
         <w:rPr>
           <w:color w:val="3A3A3A"/>
@@ -18980,8 +18928,8 @@
           <w:szCs w:val="26"/>
         </w:rPr>
       </w:pPr>
-      <w:bookmarkStart w:id="29" w:name="_6a463qccehw5" w:colFirst="0" w:colLast="0"/>
-      <w:bookmarkEnd w:id="29"/>
+      <w:bookmarkStart w:id="28" w:name="_6a463qccehw5" w:colFirst="0" w:colLast="0"/>
+      <w:bookmarkEnd w:id="28"/>
       <w:r>
         <w:rPr>
           <w:color w:val="3A3A3A"/>
@@ -19497,6 +19445,7 @@
                 <w:sz w:val="20"/>
                 <w:szCs w:val="20"/>
               </w:rPr>
+              <w:lastRenderedPageBreak/>
               <w:t>2</w:t>
             </w:r>
           </w:p>
@@ -19641,15 +19590,14 @@
           <w:szCs w:val="26"/>
         </w:rPr>
       </w:pPr>
-      <w:bookmarkStart w:id="30" w:name="_e67vguxhp3nc" w:colFirst="0" w:colLast="0"/>
-      <w:bookmarkEnd w:id="30"/>
+      <w:bookmarkStart w:id="29" w:name="_e67vguxhp3nc" w:colFirst="0" w:colLast="0"/>
+      <w:bookmarkEnd w:id="29"/>
       <w:r>
         <w:rPr>
           <w:color w:val="3A3A3A"/>
           <w:sz w:val="26"/>
           <w:szCs w:val="26"/>
         </w:rPr>
-        <w:lastRenderedPageBreak/>
         <w:t>Dimension 3: Sequencing Logic</w:t>
       </w:r>
     </w:p>
@@ -20287,14 +20235,15 @@
           <w:szCs w:val="26"/>
         </w:rPr>
       </w:pPr>
-      <w:bookmarkStart w:id="31" w:name="_6rcjuawyt40x" w:colFirst="0" w:colLast="0"/>
-      <w:bookmarkEnd w:id="31"/>
+      <w:bookmarkStart w:id="30" w:name="_6rcjuawyt40x" w:colFirst="0" w:colLast="0"/>
+      <w:bookmarkEnd w:id="30"/>
       <w:r>
         <w:rPr>
           <w:color w:val="3A3A3A"/>
           <w:sz w:val="26"/>
           <w:szCs w:val="26"/>
         </w:rPr>
+        <w:lastRenderedPageBreak/>
         <w:t>Dimension 4: Scaffolding and Gradual Release</w:t>
       </w:r>
     </w:p>
@@ -20376,7 +20325,6 @@
           <w:sz w:val="20"/>
           <w:szCs w:val="20"/>
         </w:rPr>
-        <w:lastRenderedPageBreak/>
         <w:t>Vygotsky, L.S. (1978). Mind in Society. Harvard University Press.</w:t>
       </w:r>
     </w:p>
@@ -20843,23 +20791,7 @@
                 <w:sz w:val="20"/>
                 <w:szCs w:val="20"/>
               </w:rPr>
-              <w:t xml:space="preserve">Minimal </w:t>
-            </w:r>
-            <w:proofErr w:type="gramStart"/>
-            <w:r>
-              <w:rPr>
-                <w:sz w:val="20"/>
-                <w:szCs w:val="20"/>
-              </w:rPr>
-              <w:t>scaffolding;</w:t>
-            </w:r>
-            <w:proofErr w:type="gramEnd"/>
-            <w:r>
-              <w:rPr>
-                <w:sz w:val="20"/>
-                <w:szCs w:val="20"/>
-              </w:rPr>
-              <w:t xml:space="preserve"> learners may be unsupported early.</w:t>
+              <w:t>Minimal scaffolding; learners may be unsupported early.</w:t>
             </w:r>
           </w:p>
         </w:tc>
@@ -20937,23 +20869,7 @@
                 <w:sz w:val="20"/>
                 <w:szCs w:val="20"/>
               </w:rPr>
-              <w:t xml:space="preserve">No </w:t>
-            </w:r>
-            <w:proofErr w:type="gramStart"/>
-            <w:r>
-              <w:rPr>
-                <w:sz w:val="20"/>
-                <w:szCs w:val="20"/>
-              </w:rPr>
-              <w:t>scaffolding;</w:t>
-            </w:r>
-            <w:proofErr w:type="gramEnd"/>
-            <w:r>
-              <w:rPr>
-                <w:sz w:val="20"/>
-                <w:szCs w:val="20"/>
-              </w:rPr>
-              <w:t xml:space="preserve"> independent work expected immediately.</w:t>
+              <w:t>No scaffolding; independent work expected immediately.</w:t>
             </w:r>
           </w:p>
         </w:tc>
@@ -20985,8 +20901,8 @@
           <w:szCs w:val="26"/>
         </w:rPr>
       </w:pPr>
-      <w:bookmarkStart w:id="32" w:name="_mi54jdrrmrce" w:colFirst="0" w:colLast="0"/>
-      <w:bookmarkEnd w:id="32"/>
+      <w:bookmarkStart w:id="31" w:name="_mi54jdrrmrce" w:colFirst="0" w:colLast="0"/>
+      <w:bookmarkEnd w:id="31"/>
       <w:r>
         <w:rPr>
           <w:color w:val="3A3A3A"/>
@@ -21210,7 +21126,6 @@
                 <w:sz w:val="20"/>
                 <w:szCs w:val="20"/>
               </w:rPr>
-              <w:lastRenderedPageBreak/>
               <w:t>5</w:t>
             </w:r>
           </w:p>
@@ -21589,8 +21504,8 @@
           <w:szCs w:val="26"/>
         </w:rPr>
       </w:pPr>
-      <w:bookmarkStart w:id="33" w:name="_7cfrh7juy5ez" w:colFirst="0" w:colLast="0"/>
-      <w:bookmarkEnd w:id="33"/>
+      <w:bookmarkStart w:id="32" w:name="_7cfrh7juy5ez" w:colFirst="0" w:colLast="0"/>
+      <w:bookmarkEnd w:id="32"/>
       <w:r>
         <w:rPr>
           <w:color w:val="3A3A3A"/>
@@ -21986,6 +21901,7 @@
                 <w:sz w:val="20"/>
                 <w:szCs w:val="20"/>
               </w:rPr>
+              <w:lastRenderedPageBreak/>
               <w:t>3</w:t>
             </w:r>
           </w:p>
@@ -22142,7 +22058,6 @@
                 <w:sz w:val="20"/>
                 <w:szCs w:val="20"/>
               </w:rPr>
-              <w:lastRenderedPageBreak/>
               <w:t>1</w:t>
             </w:r>
           </w:p>
@@ -22238,8 +22153,8 @@
           <w:szCs w:val="46"/>
         </w:rPr>
       </w:pPr>
-      <w:bookmarkStart w:id="34" w:name="_72rjtdsg60ik" w:colFirst="0" w:colLast="0"/>
-      <w:bookmarkEnd w:id="34"/>
+      <w:bookmarkStart w:id="33" w:name="_72rjtdsg60ik" w:colFirst="0" w:colLast="0"/>
+      <w:bookmarkEnd w:id="33"/>
       <w:r>
         <w:rPr>
           <w:color w:val="1B3A5C"/>
@@ -22373,8 +22288,8 @@
           <w:szCs w:val="26"/>
         </w:rPr>
       </w:pPr>
-      <w:bookmarkStart w:id="35" w:name="_c6yu55ir7ci1" w:colFirst="0" w:colLast="0"/>
-      <w:bookmarkEnd w:id="35"/>
+      <w:bookmarkStart w:id="34" w:name="_c6yu55ir7ci1" w:colFirst="0" w:colLast="0"/>
+      <w:bookmarkEnd w:id="34"/>
       <w:r>
         <w:rPr>
           <w:color w:val="3A3A3A"/>
@@ -23057,8 +22972,8 @@
           <w:szCs w:val="26"/>
         </w:rPr>
       </w:pPr>
-      <w:bookmarkStart w:id="36" w:name="_x8arsnk0blnz" w:colFirst="0" w:colLast="0"/>
-      <w:bookmarkEnd w:id="36"/>
+      <w:bookmarkStart w:id="35" w:name="_x8arsnk0blnz" w:colFirst="0" w:colLast="0"/>
+      <w:bookmarkEnd w:id="35"/>
       <w:r>
         <w:rPr>
           <w:color w:val="3A3A3A"/>
@@ -23759,8 +23674,8 @@
           <w:szCs w:val="26"/>
         </w:rPr>
       </w:pPr>
-      <w:bookmarkStart w:id="37" w:name="_qizt8m1e2ao7" w:colFirst="0" w:colLast="0"/>
-      <w:bookmarkEnd w:id="37"/>
+      <w:bookmarkStart w:id="36" w:name="_qizt8m1e2ao7" w:colFirst="0" w:colLast="0"/>
+      <w:bookmarkEnd w:id="36"/>
       <w:r>
         <w:rPr>
           <w:color w:val="3A3A3A"/>
@@ -24396,8 +24311,8 @@
           <w:szCs w:val="26"/>
         </w:rPr>
       </w:pPr>
-      <w:bookmarkStart w:id="38" w:name="_962m8i1jgaa0" w:colFirst="0" w:colLast="0"/>
-      <w:bookmarkEnd w:id="38"/>
+      <w:bookmarkStart w:id="37" w:name="_962m8i1jgaa0" w:colFirst="0" w:colLast="0"/>
+      <w:bookmarkEnd w:id="37"/>
       <w:r>
         <w:rPr>
           <w:color w:val="3A3A3A"/>
@@ -24991,8 +24906,8 @@
           <w:szCs w:val="26"/>
         </w:rPr>
       </w:pPr>
-      <w:bookmarkStart w:id="39" w:name="_oga1vk3py16i" w:colFirst="0" w:colLast="0"/>
-      <w:bookmarkEnd w:id="39"/>
+      <w:bookmarkStart w:id="38" w:name="_oga1vk3py16i" w:colFirst="0" w:colLast="0"/>
+      <w:bookmarkEnd w:id="38"/>
       <w:r>
         <w:rPr>
           <w:color w:val="3A3A3A"/>
@@ -25622,8 +25537,8 @@
           <w:szCs w:val="26"/>
         </w:rPr>
       </w:pPr>
-      <w:bookmarkStart w:id="40" w:name="_my54qt8812ub" w:colFirst="0" w:colLast="0"/>
-      <w:bookmarkEnd w:id="40"/>
+      <w:bookmarkStart w:id="39" w:name="_my54qt8812ub" w:colFirst="0" w:colLast="0"/>
+      <w:bookmarkEnd w:id="39"/>
       <w:r>
         <w:rPr>
           <w:color w:val="3A3A3A"/>
@@ -26046,23 +25961,7 @@
                 <w:sz w:val="20"/>
                 <w:szCs w:val="20"/>
               </w:rPr>
-              <w:t xml:space="preserve">Mostly clear; minor readability or </w:t>
-            </w:r>
-            <w:proofErr w:type="gramStart"/>
-            <w:r>
-              <w:rPr>
-                <w:sz w:val="20"/>
-                <w:szCs w:val="20"/>
-              </w:rPr>
-              <w:t>organization</w:t>
-            </w:r>
-            <w:proofErr w:type="gramEnd"/>
-            <w:r>
-              <w:rPr>
-                <w:sz w:val="20"/>
-                <w:szCs w:val="20"/>
-              </w:rPr>
-              <w:t xml:space="preserve"> issues.</w:t>
+              <w:t>Mostly clear; minor readability or organization issues.</w:t>
             </w:r>
           </w:p>
         </w:tc>
@@ -26357,8 +26256,8 @@
           <w:szCs w:val="46"/>
         </w:rPr>
       </w:pPr>
-      <w:bookmarkStart w:id="41" w:name="_bsgjmfdetjz2" w:colFirst="0" w:colLast="0"/>
-      <w:bookmarkEnd w:id="41"/>
+      <w:bookmarkStart w:id="40" w:name="_bsgjmfdetjz2" w:colFirst="0" w:colLast="0"/>
+      <w:bookmarkEnd w:id="40"/>
       <w:r>
         <w:rPr>
           <w:color w:val="1B3A5C"/>
@@ -26476,8 +26375,8 @@
           <w:szCs w:val="26"/>
         </w:rPr>
       </w:pPr>
-      <w:bookmarkStart w:id="42" w:name="_om31n2b6q4zp" w:colFirst="0" w:colLast="0"/>
-      <w:bookmarkEnd w:id="42"/>
+      <w:bookmarkStart w:id="41" w:name="_om31n2b6q4zp" w:colFirst="0" w:colLast="0"/>
+      <w:bookmarkEnd w:id="41"/>
       <w:r>
         <w:rPr>
           <w:color w:val="3A3A3A"/>
@@ -27154,8 +27053,8 @@
           <w:szCs w:val="26"/>
         </w:rPr>
       </w:pPr>
-      <w:bookmarkStart w:id="43" w:name="_wxdfcljvaf3y" w:colFirst="0" w:colLast="0"/>
-      <w:bookmarkEnd w:id="43"/>
+      <w:bookmarkStart w:id="42" w:name="_wxdfcljvaf3y" w:colFirst="0" w:colLast="0"/>
+      <w:bookmarkEnd w:id="42"/>
       <w:r>
         <w:rPr>
           <w:color w:val="3A3A3A"/>
@@ -27807,8 +27706,8 @@
           <w:szCs w:val="26"/>
         </w:rPr>
       </w:pPr>
-      <w:bookmarkStart w:id="44" w:name="_sfvzju6d01m6" w:colFirst="0" w:colLast="0"/>
-      <w:bookmarkEnd w:id="44"/>
+      <w:bookmarkStart w:id="43" w:name="_sfvzju6d01m6" w:colFirst="0" w:colLast="0"/>
+      <w:bookmarkEnd w:id="43"/>
       <w:r>
         <w:rPr>
           <w:color w:val="3A3A3A"/>
@@ -28410,8 +28309,8 @@
           <w:szCs w:val="26"/>
         </w:rPr>
       </w:pPr>
-      <w:bookmarkStart w:id="45" w:name="_qa99zdytymyk" w:colFirst="0" w:colLast="0"/>
-      <w:bookmarkEnd w:id="45"/>
+      <w:bookmarkStart w:id="44" w:name="_qa99zdytymyk" w:colFirst="0" w:colLast="0"/>
+      <w:bookmarkEnd w:id="44"/>
       <w:r>
         <w:rPr>
           <w:color w:val="3A3A3A"/>
@@ -29030,8 +28929,8 @@
           <w:szCs w:val="26"/>
         </w:rPr>
       </w:pPr>
-      <w:bookmarkStart w:id="46" w:name="_2sgidvgfdbdc" w:colFirst="0" w:colLast="0"/>
-      <w:bookmarkEnd w:id="46"/>
+      <w:bookmarkStart w:id="45" w:name="_2sgidvgfdbdc" w:colFirst="0" w:colLast="0"/>
+      <w:bookmarkEnd w:id="45"/>
       <w:r>
         <w:rPr>
           <w:color w:val="3A3A3A"/>
@@ -29676,8 +29575,8 @@
           <w:szCs w:val="26"/>
         </w:rPr>
       </w:pPr>
-      <w:bookmarkStart w:id="47" w:name="_png91fhhx3rp" w:colFirst="0" w:colLast="0"/>
-      <w:bookmarkEnd w:id="47"/>
+      <w:bookmarkStart w:id="46" w:name="_png91fhhx3rp" w:colFirst="0" w:colLast="0"/>
+      <w:bookmarkEnd w:id="46"/>
       <w:r>
         <w:rPr>
           <w:color w:val="3A3A3A"/>
@@ -30336,8 +30235,8 @@
           <w:szCs w:val="46"/>
         </w:rPr>
       </w:pPr>
-      <w:bookmarkStart w:id="48" w:name="_o4qd5sr8ydoh" w:colFirst="0" w:colLast="0"/>
-      <w:bookmarkEnd w:id="48"/>
+      <w:bookmarkStart w:id="47" w:name="_o4qd5sr8ydoh" w:colFirst="0" w:colLast="0"/>
+      <w:bookmarkEnd w:id="47"/>
       <w:r>
         <w:rPr>
           <w:color w:val="1B3A5C"/>
@@ -30471,8 +30370,8 @@
           <w:szCs w:val="26"/>
         </w:rPr>
       </w:pPr>
-      <w:bookmarkStart w:id="49" w:name="_4kqwz3oljqqo" w:colFirst="0" w:colLast="0"/>
-      <w:bookmarkEnd w:id="49"/>
+      <w:bookmarkStart w:id="48" w:name="_4kqwz3oljqqo" w:colFirst="0" w:colLast="0"/>
+      <w:bookmarkEnd w:id="48"/>
       <w:r>
         <w:rPr>
           <w:color w:val="3A3A3A"/>
@@ -31137,8 +31036,8 @@
           <w:szCs w:val="26"/>
         </w:rPr>
       </w:pPr>
-      <w:bookmarkStart w:id="50" w:name="_e64jlt2p75aw" w:colFirst="0" w:colLast="0"/>
-      <w:bookmarkEnd w:id="50"/>
+      <w:bookmarkStart w:id="49" w:name="_e64jlt2p75aw" w:colFirst="0" w:colLast="0"/>
+      <w:bookmarkEnd w:id="49"/>
       <w:r>
         <w:rPr>
           <w:color w:val="3A3A3A"/>
@@ -31741,8 +31640,8 @@
           <w:szCs w:val="26"/>
         </w:rPr>
       </w:pPr>
-      <w:bookmarkStart w:id="51" w:name="_wm3f5hi2k8xo" w:colFirst="0" w:colLast="0"/>
-      <w:bookmarkEnd w:id="51"/>
+      <w:bookmarkStart w:id="50" w:name="_wm3f5hi2k8xo" w:colFirst="0" w:colLast="0"/>
+      <w:bookmarkEnd w:id="50"/>
       <w:r>
         <w:rPr>
           <w:color w:val="3A3A3A"/>
@@ -32042,23 +31941,7 @@
                 <w:sz w:val="20"/>
                 <w:szCs w:val="20"/>
               </w:rPr>
-              <w:t xml:space="preserve">Explicit alignment </w:t>
-            </w:r>
-            <w:proofErr w:type="gramStart"/>
-            <w:r>
-              <w:rPr>
-                <w:sz w:val="20"/>
-                <w:szCs w:val="20"/>
-              </w:rPr>
-              <w:t>table;</w:t>
-            </w:r>
-            <w:proofErr w:type="gramEnd"/>
-            <w:r>
-              <w:rPr>
-                <w:sz w:val="20"/>
-                <w:szCs w:val="20"/>
-              </w:rPr>
-              <w:t xml:space="preserve"> complete instruments attached; multiple complementary methods; all questions covered.</w:t>
+              <w:t>Explicit alignment table; complete instruments attached; multiple complementary methods; all questions covered.</w:t>
             </w:r>
           </w:p>
         </w:tc>
@@ -32136,23 +32019,7 @@
                 <w:sz w:val="20"/>
                 <w:szCs w:val="20"/>
               </w:rPr>
-              <w:t xml:space="preserve">Good </w:t>
-            </w:r>
-            <w:proofErr w:type="gramStart"/>
-            <w:r>
-              <w:rPr>
-                <w:sz w:val="20"/>
-                <w:szCs w:val="20"/>
-              </w:rPr>
-              <w:t>alignment;</w:t>
-            </w:r>
-            <w:proofErr w:type="gramEnd"/>
-            <w:r>
-              <w:rPr>
-                <w:sz w:val="20"/>
-                <w:szCs w:val="20"/>
-              </w:rPr>
-              <w:t xml:space="preserve"> instruments attached or detailed; well-matched methods; comprehensive coverage.</w:t>
+              <w:t>Good alignment; instruments attached or detailed; well-matched methods; comprehensive coverage.</w:t>
             </w:r>
           </w:p>
         </w:tc>
@@ -32230,23 +32097,7 @@
                 <w:sz w:val="20"/>
                 <w:szCs w:val="20"/>
               </w:rPr>
-              <w:t xml:space="preserve">Moderate </w:t>
-            </w:r>
-            <w:proofErr w:type="gramStart"/>
-            <w:r>
-              <w:rPr>
-                <w:sz w:val="20"/>
-                <w:szCs w:val="20"/>
-              </w:rPr>
-              <w:t>alignment;</w:t>
-            </w:r>
-            <w:proofErr w:type="gramEnd"/>
-            <w:r>
-              <w:rPr>
-                <w:sz w:val="20"/>
-                <w:szCs w:val="20"/>
-              </w:rPr>
-              <w:t xml:space="preserve"> most instruments specified; appropriate methods; covers most questions.</w:t>
+              <w:t>Moderate alignment; most instruments specified; appropriate methods; covers most questions.</w:t>
             </w:r>
           </w:p>
         </w:tc>
@@ -32324,23 +32175,7 @@
                 <w:sz w:val="20"/>
                 <w:szCs w:val="20"/>
               </w:rPr>
-              <w:t xml:space="preserve">Weak </w:t>
-            </w:r>
-            <w:proofErr w:type="gramStart"/>
-            <w:r>
-              <w:rPr>
-                <w:sz w:val="20"/>
-                <w:szCs w:val="20"/>
-              </w:rPr>
-              <w:t>connection;</w:t>
-            </w:r>
-            <w:proofErr w:type="gramEnd"/>
-            <w:r>
-              <w:rPr>
-                <w:sz w:val="20"/>
-                <w:szCs w:val="20"/>
-              </w:rPr>
-              <w:t xml:space="preserve"> some instruments listed; mostly appropriate; coverage gaps.</w:t>
+              <w:t>Weak connection; some instruments listed; mostly appropriate; coverage gaps.</w:t>
             </w:r>
           </w:p>
         </w:tc>
@@ -32468,8 +32303,8 @@
           <w:szCs w:val="26"/>
         </w:rPr>
       </w:pPr>
-      <w:bookmarkStart w:id="52" w:name="_uyoasvxz6w0" w:colFirst="0" w:colLast="0"/>
-      <w:bookmarkEnd w:id="52"/>
+      <w:bookmarkStart w:id="51" w:name="_uyoasvxz6w0" w:colFirst="0" w:colLast="0"/>
+      <w:bookmarkEnd w:id="51"/>
       <w:r>
         <w:rPr>
           <w:color w:val="3A3A3A"/>
@@ -32857,23 +32692,7 @@
                 <w:sz w:val="20"/>
                 <w:szCs w:val="20"/>
               </w:rPr>
-              <w:t xml:space="preserve"> documented </w:t>
-            </w:r>
-            <w:proofErr w:type="gramStart"/>
-            <w:r>
-              <w:rPr>
-                <w:sz w:val="20"/>
-                <w:szCs w:val="20"/>
-              </w:rPr>
-              <w:t>process;</w:t>
-            </w:r>
-            <w:proofErr w:type="gramEnd"/>
-            <w:r>
-              <w:rPr>
-                <w:sz w:val="20"/>
-                <w:szCs w:val="20"/>
-              </w:rPr>
-              <w:t xml:space="preserve"> severity applied; clear threshold; well-documented; tracked.</w:t>
+              <w:t xml:space="preserve"> documented process; severity applied; clear threshold; well-documented; tracked.</w:t>
             </w:r>
           </w:p>
         </w:tc>
@@ -33166,8 +32985,8 @@
           <w:szCs w:val="26"/>
         </w:rPr>
       </w:pPr>
-      <w:bookmarkStart w:id="53" w:name="_ovo0h6kbvb0w" w:colFirst="0" w:colLast="0"/>
-      <w:bookmarkEnd w:id="53"/>
+      <w:bookmarkStart w:id="52" w:name="_ovo0h6kbvb0w" w:colFirst="0" w:colLast="0"/>
+      <w:bookmarkEnd w:id="52"/>
       <w:r>
         <w:rPr>
           <w:color w:val="3A3A3A"/>
@@ -33770,8 +33589,8 @@
           <w:szCs w:val="26"/>
         </w:rPr>
       </w:pPr>
-      <w:bookmarkStart w:id="54" w:name="_66ya1xtc9j1p" w:colFirst="0" w:colLast="0"/>
-      <w:bookmarkEnd w:id="54"/>
+      <w:bookmarkStart w:id="53" w:name="_66ya1xtc9j1p" w:colFirst="0" w:colLast="0"/>
+      <w:bookmarkEnd w:id="53"/>
       <w:r>
         <w:rPr>
           <w:color w:val="3A3A3A"/>
@@ -34473,8 +34292,8 @@
           <w:szCs w:val="46"/>
         </w:rPr>
       </w:pPr>
-      <w:bookmarkStart w:id="55" w:name="_w9jbbmzdecc8" w:colFirst="0" w:colLast="0"/>
-      <w:bookmarkEnd w:id="55"/>
+      <w:bookmarkStart w:id="54" w:name="_w9jbbmzdecc8" w:colFirst="0" w:colLast="0"/>
+      <w:bookmarkEnd w:id="54"/>
       <w:r>
         <w:rPr>
           <w:color w:val="1B3A5C"/>
@@ -34633,8 +34452,8 @@
           <w:szCs w:val="26"/>
         </w:rPr>
       </w:pPr>
-      <w:bookmarkStart w:id="56" w:name="_2dhssulofes6" w:colFirst="0" w:colLast="0"/>
-      <w:bookmarkEnd w:id="56"/>
+      <w:bookmarkStart w:id="55" w:name="_2dhssulofes6" w:colFirst="0" w:colLast="0"/>
+      <w:bookmarkEnd w:id="55"/>
       <w:r>
         <w:rPr>
           <w:color w:val="3A3A3A"/>
@@ -35279,8 +35098,8 @@
           <w:szCs w:val="26"/>
         </w:rPr>
       </w:pPr>
-      <w:bookmarkStart w:id="57" w:name="_en1clwyouo5u" w:colFirst="0" w:colLast="0"/>
-      <w:bookmarkEnd w:id="57"/>
+      <w:bookmarkStart w:id="56" w:name="_en1clwyouo5u" w:colFirst="0" w:colLast="0"/>
+      <w:bookmarkEnd w:id="56"/>
       <w:r>
         <w:rPr>
           <w:color w:val="3A3A3A"/>
@@ -35940,23 +35759,7 @@
                 <w:sz w:val="20"/>
                 <w:szCs w:val="20"/>
               </w:rPr>
-              <w:t xml:space="preserve">No cause </w:t>
-            </w:r>
-            <w:proofErr w:type="gramStart"/>
-            <w:r>
-              <w:rPr>
-                <w:sz w:val="20"/>
-                <w:szCs w:val="20"/>
-              </w:rPr>
-              <w:t>analysis;</w:t>
-            </w:r>
-            <w:proofErr w:type="gramEnd"/>
-            <w:r>
-              <w:rPr>
-                <w:sz w:val="20"/>
-                <w:szCs w:val="20"/>
-              </w:rPr>
-              <w:t xml:space="preserve"> assumes training is the answer; gaps not distinguished.</w:t>
+              <w:t>No cause analysis; assumes training is the answer; gaps not distinguished.</w:t>
             </w:r>
           </w:p>
         </w:tc>
@@ -35988,8 +35791,8 @@
           <w:szCs w:val="26"/>
         </w:rPr>
       </w:pPr>
-      <w:bookmarkStart w:id="58" w:name="_417t6bb514yj" w:colFirst="0" w:colLast="0"/>
-      <w:bookmarkEnd w:id="58"/>
+      <w:bookmarkStart w:id="57" w:name="_417t6bb514yj" w:colFirst="0" w:colLast="0"/>
+      <w:bookmarkEnd w:id="57"/>
       <w:r>
         <w:rPr>
           <w:color w:val="3A3A3A"/>
@@ -36583,6 +36386,7 @@
                 <w:sz w:val="20"/>
                 <w:szCs w:val="20"/>
               </w:rPr>
+              <w:lastRenderedPageBreak/>
               <w:t>1</w:t>
             </w:r>
           </w:p>
@@ -36649,8 +36453,8 @@
           <w:szCs w:val="26"/>
         </w:rPr>
       </w:pPr>
-      <w:bookmarkStart w:id="59" w:name="_vlcpvqnh4msy" w:colFirst="0" w:colLast="0"/>
-      <w:bookmarkEnd w:id="59"/>
+      <w:bookmarkStart w:id="58" w:name="_vlcpvqnh4msy" w:colFirst="0" w:colLast="0"/>
+      <w:bookmarkEnd w:id="58"/>
     </w:p>
     <w:p>
       <w:pPr>
@@ -36662,15 +36466,14 @@
           <w:szCs w:val="26"/>
         </w:rPr>
       </w:pPr>
-      <w:bookmarkStart w:id="60" w:name="_phgkkdev4kh9" w:colFirst="0" w:colLast="0"/>
-      <w:bookmarkEnd w:id="60"/>
+      <w:bookmarkStart w:id="59" w:name="_phgkkdev4kh9" w:colFirst="0" w:colLast="0"/>
+      <w:bookmarkEnd w:id="59"/>
       <w:r>
         <w:rPr>
           <w:color w:val="3A3A3A"/>
           <w:sz w:val="26"/>
           <w:szCs w:val="26"/>
         </w:rPr>
-        <w:lastRenderedPageBreak/>
         <w:t>Dimension 4: Goal and Objective Quality</w:t>
       </w:r>
     </w:p>
@@ -37308,14 +37111,15 @@
           <w:szCs w:val="26"/>
         </w:rPr>
       </w:pPr>
-      <w:bookmarkStart w:id="61" w:name="_4o9osae16xnk" w:colFirst="0" w:colLast="0"/>
-      <w:bookmarkEnd w:id="61"/>
+      <w:bookmarkStart w:id="60" w:name="_4o9osae16xnk" w:colFirst="0" w:colLast="0"/>
+      <w:bookmarkEnd w:id="60"/>
       <w:r>
         <w:rPr>
           <w:color w:val="3A3A3A"/>
           <w:sz w:val="26"/>
           <w:szCs w:val="26"/>
         </w:rPr>
+        <w:lastRenderedPageBreak/>
         <w:t>Dimension 5: Stakeholder Alignment</w:t>
       </w:r>
     </w:p>
@@ -37388,7 +37192,6 @@
           <w:sz w:val="20"/>
           <w:szCs w:val="20"/>
         </w:rPr>
-        <w:lastRenderedPageBreak/>
         <w:t>Scoring Criteria:</w:t>
       </w:r>
     </w:p>
@@ -37914,8 +37717,8 @@
           <w:szCs w:val="26"/>
         </w:rPr>
       </w:pPr>
-      <w:bookmarkStart w:id="62" w:name="_czl2p251l0g4" w:colFirst="0" w:colLast="0"/>
-      <w:bookmarkEnd w:id="62"/>
+      <w:bookmarkStart w:id="61" w:name="_czl2p251l0g4" w:colFirst="0" w:colLast="0"/>
+      <w:bookmarkEnd w:id="61"/>
       <w:r>
         <w:rPr>
           <w:color w:val="3A3A3A"/>
@@ -38057,6 +37860,7 @@
                 <w:sz w:val="20"/>
                 <w:szCs w:val="20"/>
               </w:rPr>
+              <w:lastRenderedPageBreak/>
               <w:t>Score</w:t>
             </w:r>
           </w:p>
@@ -38219,7 +38023,6 @@
                 <w:sz w:val="20"/>
                 <w:szCs w:val="20"/>
               </w:rPr>
-              <w:lastRenderedPageBreak/>
               <w:t>4</w:t>
             </w:r>
           </w:p>
@@ -38254,23 +38057,7 @@
                 <w:sz w:val="20"/>
                 <w:szCs w:val="20"/>
               </w:rPr>
-              <w:t xml:space="preserve">Good </w:t>
-            </w:r>
-            <w:proofErr w:type="gramStart"/>
-            <w:r>
-              <w:rPr>
-                <w:sz w:val="20"/>
-                <w:szCs w:val="20"/>
-              </w:rPr>
-              <w:t>match;</w:t>
-            </w:r>
-            <w:proofErr w:type="gramEnd"/>
-            <w:r>
-              <w:rPr>
-                <w:sz w:val="20"/>
-                <w:szCs w:val="20"/>
-              </w:rPr>
-              <w:t xml:space="preserve"> multiple interventions explored; training justified with evidence.</w:t>
+              <w:t>Good match; multiple interventions explored; training justified with evidence.</w:t>
             </w:r>
           </w:p>
         </w:tc>
@@ -38426,23 +38213,7 @@
                 <w:sz w:val="20"/>
                 <w:szCs w:val="20"/>
               </w:rPr>
-              <w:t xml:space="preserve">Partial </w:t>
-            </w:r>
-            <w:proofErr w:type="gramStart"/>
-            <w:r>
-              <w:rPr>
-                <w:sz w:val="20"/>
-                <w:szCs w:val="20"/>
-              </w:rPr>
-              <w:t>match;</w:t>
-            </w:r>
-            <w:proofErr w:type="gramEnd"/>
-            <w:r>
-              <w:rPr>
-                <w:sz w:val="20"/>
-                <w:szCs w:val="20"/>
-              </w:rPr>
-              <w:t xml:space="preserve"> training primary but may be wrong; weak justification.</w:t>
+              <w:t>Partial match; training primary but may be wrong; weak justification.</w:t>
             </w:r>
           </w:p>
         </w:tc>
@@ -38581,8 +38352,8 @@
           <w:szCs w:val="46"/>
         </w:rPr>
       </w:pPr>
-      <w:bookmarkStart w:id="63" w:name="_qqgwu4onq3" w:colFirst="0" w:colLast="0"/>
-      <w:bookmarkEnd w:id="63"/>
+      <w:bookmarkStart w:id="62" w:name="_qqgwu4onq3" w:colFirst="0" w:colLast="0"/>
+      <w:bookmarkEnd w:id="62"/>
       <w:r>
         <w:rPr>
           <w:color w:val="1B3A5C"/>
@@ -38716,8 +38487,8 @@
           <w:szCs w:val="26"/>
         </w:rPr>
       </w:pPr>
-      <w:bookmarkStart w:id="64" w:name="_83t66xs54szs" w:colFirst="0" w:colLast="0"/>
-      <w:bookmarkEnd w:id="64"/>
+      <w:bookmarkStart w:id="63" w:name="_83t66xs54szs" w:colFirst="0" w:colLast="0"/>
+      <w:bookmarkEnd w:id="63"/>
       <w:r>
         <w:rPr>
           <w:color w:val="3A3A3A"/>
@@ -39472,8 +39243,8 @@
           <w:szCs w:val="26"/>
         </w:rPr>
       </w:pPr>
-      <w:bookmarkStart w:id="65" w:name="_m0usmid5wgr8" w:colFirst="0" w:colLast="0"/>
-      <w:bookmarkEnd w:id="65"/>
+      <w:bookmarkStart w:id="64" w:name="_m0usmid5wgr8" w:colFirst="0" w:colLast="0"/>
+      <w:bookmarkEnd w:id="64"/>
       <w:r>
         <w:rPr>
           <w:color w:val="3A3A3A"/>
@@ -40137,8 +39908,8 @@
           <w:szCs w:val="26"/>
         </w:rPr>
       </w:pPr>
-      <w:bookmarkStart w:id="66" w:name="_kv2etpx5iwwt" w:colFirst="0" w:colLast="0"/>
-      <w:bookmarkEnd w:id="66"/>
+      <w:bookmarkStart w:id="65" w:name="_kv2etpx5iwwt" w:colFirst="0" w:colLast="0"/>
+      <w:bookmarkEnd w:id="65"/>
       <w:r>
         <w:rPr>
           <w:color w:val="3A3A3A"/>
@@ -40795,8 +40566,8 @@
           <w:szCs w:val="26"/>
         </w:rPr>
       </w:pPr>
-      <w:bookmarkStart w:id="67" w:name="_niqpl5ed76kz" w:colFirst="0" w:colLast="0"/>
-      <w:bookmarkEnd w:id="67"/>
+      <w:bookmarkStart w:id="66" w:name="_niqpl5ed76kz" w:colFirst="0" w:colLast="0"/>
+      <w:bookmarkEnd w:id="66"/>
       <w:r>
         <w:rPr>
           <w:color w:val="3A3A3A"/>
@@ -41202,23 +40973,7 @@
                 <w:sz w:val="20"/>
                 <w:szCs w:val="20"/>
               </w:rPr>
-              <w:t xml:space="preserve">Moderate </w:t>
-            </w:r>
-            <w:proofErr w:type="gramStart"/>
-            <w:r>
-              <w:rPr>
-                <w:sz w:val="20"/>
-                <w:szCs w:val="20"/>
-              </w:rPr>
-              <w:t>engagement;</w:t>
-            </w:r>
-            <w:proofErr w:type="gramEnd"/>
-            <w:r>
-              <w:rPr>
-                <w:sz w:val="20"/>
-                <w:szCs w:val="20"/>
-              </w:rPr>
-              <w:t xml:space="preserve"> some tension and stakes; mostly productive; occasional overwhelming moments.</w:t>
+              <w:t>Moderate engagement; some tension and stakes; mostly productive; occasional overwhelming moments.</w:t>
             </w:r>
           </w:p>
         </w:tc>
@@ -41422,8 +41177,8 @@
           <w:szCs w:val="26"/>
         </w:rPr>
       </w:pPr>
-      <w:bookmarkStart w:id="68" w:name="_qknrxmbbr0c8" w:colFirst="0" w:colLast="0"/>
-      <w:bookmarkEnd w:id="68"/>
+      <w:bookmarkStart w:id="67" w:name="_qknrxmbbr0c8" w:colFirst="0" w:colLast="0"/>
+      <w:bookmarkEnd w:id="67"/>
       <w:r>
         <w:rPr>
           <w:color w:val="3A3A3A"/>
@@ -42026,8 +41781,8 @@
           <w:szCs w:val="26"/>
         </w:rPr>
       </w:pPr>
-      <w:bookmarkStart w:id="69" w:name="_7tjhprxi6if1" w:colFirst="0" w:colLast="0"/>
-      <w:bookmarkEnd w:id="69"/>
+      <w:bookmarkStart w:id="68" w:name="_7tjhprxi6if1" w:colFirst="0" w:colLast="0"/>
+      <w:bookmarkEnd w:id="68"/>
       <w:r>
         <w:rPr>
           <w:color w:val="3A3A3A"/>
@@ -42629,8 +42384,6 @@
           <w:szCs w:val="46"/>
         </w:rPr>
       </w:pPr>
-      <w:bookmarkStart w:id="70" w:name="_6jfy5trkcfmn" w:colFirst="0" w:colLast="0"/>
-      <w:bookmarkEnd w:id="70"/>
       <w:r>
         <w:rPr>
           <w:color w:val="1B3A5C"/>
@@ -42812,8 +42565,8 @@
           <w:szCs w:val="26"/>
         </w:rPr>
       </w:pPr>
-      <w:bookmarkStart w:id="71" w:name="_2nz94tez4ztr" w:colFirst="0" w:colLast="0"/>
-      <w:bookmarkEnd w:id="71"/>
+      <w:bookmarkStart w:id="69" w:name="_2nz94tez4ztr" w:colFirst="0" w:colLast="0"/>
+      <w:bookmarkEnd w:id="69"/>
       <w:r>
         <w:rPr>
           <w:color w:val="3A3A3A"/>
@@ -43526,8 +43279,8 @@
           <w:szCs w:val="26"/>
         </w:rPr>
       </w:pPr>
-      <w:bookmarkStart w:id="72" w:name="_c90okho40sy9" w:colFirst="0" w:colLast="0"/>
-      <w:bookmarkEnd w:id="72"/>
+      <w:bookmarkStart w:id="70" w:name="_c90okho40sy9" w:colFirst="0" w:colLast="0"/>
+      <w:bookmarkEnd w:id="70"/>
       <w:r>
         <w:rPr>
           <w:color w:val="3A3A3A"/>
@@ -44285,8 +44038,8 @@
           <w:szCs w:val="26"/>
         </w:rPr>
       </w:pPr>
-      <w:bookmarkStart w:id="73" w:name="_nkm209ppwhyo" w:colFirst="0" w:colLast="0"/>
-      <w:bookmarkEnd w:id="73"/>
+      <w:bookmarkStart w:id="71" w:name="_nkm209ppwhyo" w:colFirst="0" w:colLast="0"/>
+      <w:bookmarkEnd w:id="71"/>
       <w:r>
         <w:rPr>
           <w:color w:val="3A3A3A"/>
@@ -44996,8 +44749,8 @@
           <w:szCs w:val="26"/>
         </w:rPr>
       </w:pPr>
-      <w:bookmarkStart w:id="74" w:name="_vih0kz6updsu" w:colFirst="0" w:colLast="0"/>
-      <w:bookmarkEnd w:id="74"/>
+      <w:bookmarkStart w:id="72" w:name="_vih0kz6updsu" w:colFirst="0" w:colLast="0"/>
+      <w:bookmarkEnd w:id="72"/>
       <w:r>
         <w:rPr>
           <w:color w:val="3A3A3A"/>
@@ -45675,8 +45428,8 @@
           <w:szCs w:val="26"/>
         </w:rPr>
       </w:pPr>
-      <w:bookmarkStart w:id="75" w:name="_sqqdw2vbpvjh" w:colFirst="0" w:colLast="0"/>
-      <w:bookmarkEnd w:id="75"/>
+      <w:bookmarkStart w:id="73" w:name="_sqqdw2vbpvjh" w:colFirst="0" w:colLast="0"/>
+      <w:bookmarkEnd w:id="73"/>
       <w:r>
         <w:rPr>
           <w:color w:val="3A3A3A"/>
@@ -46369,8 +46122,8 @@
           <w:szCs w:val="26"/>
         </w:rPr>
       </w:pPr>
-      <w:bookmarkStart w:id="76" w:name="_68k0n7pqep9" w:colFirst="0" w:colLast="0"/>
-      <w:bookmarkEnd w:id="76"/>
+      <w:bookmarkStart w:id="74" w:name="_68k0n7pqep9" w:colFirst="0" w:colLast="0"/>
+      <w:bookmarkEnd w:id="74"/>
       <w:r>
         <w:rPr>
           <w:color w:val="3A3A3A"/>
@@ -47044,8 +46797,8 @@
           <w:szCs w:val="46"/>
         </w:rPr>
       </w:pPr>
-      <w:bookmarkStart w:id="70" w:name="_6jfy5trkcfmn" w:colFirst="0" w:colLast="0"/>
-      <w:bookmarkEnd w:id="70"/>
+      <w:bookmarkStart w:id="75" w:name="_6jfy5trkcfmn" w:colFirst="0" w:colLast="0"/>
+      <w:bookmarkEnd w:id="75"/>
       <w:r>
         <w:rPr>
           <w:color w:val="1B3A5C"/>
@@ -47070,8 +46823,6 @@
         </w:rPr>
         <w:t>Evaluates whether an instructional artifact's internal pieces - objectives, instructional strategies (content, activities, chunking, sequencing), and learner assessments - cohere with each other and with broader scopes (course-level vertical progression, discipline-level competencies). This archetype operationalizes the Efficient quality outcome (Merrill, 2002) per the alignment mapping in Hirumi (2025). It does not evaluate the quality of any individual component - other archetypes (02, 03, 07) do that. It evaluates whether the components, taken together, say the same thing.</w:t>
       </w:r>
-      <w:proofErr w:type="gramStart"/>
-      <w:proofErr w:type="gramEnd"/>
     </w:p>
     <w:tbl>
       <w:tblPr>
@@ -47116,6 +46867,8 @@
           <w:p>
             <w:r>
               <w:t>When to use this archetype:</w:t>
+            </w:r>
+            <w:r>
               <w:br/>
               <w:t>Apply for end-to-end course design reviews (objectives + lessons + assessments together), curriculum mapping against professional competencies, Bloom-drift checks between stated and tested behavior, detecting orphan objectives or extraneous instruction, and vertical alignment review across modules in a course or courses in a program. Run in addition to component archetypes (02, 03, 07) when the question is whether the pieces hang together rather than whether any one piece is well-designed.</w:t>
             </w:r>
@@ -47136,6 +46889,7 @@
           <w:sz w:val="20"/>
           <w:szCs w:val="20"/>
         </w:rPr>
+        <w:lastRenderedPageBreak/>
         <w:t xml:space="preserve"> </w:t>
       </w:r>
     </w:p>
@@ -47149,8 +46903,6 @@
           <w:szCs w:val="26"/>
         </w:rPr>
       </w:pPr>
-      <w:bookmarkStart w:id="13" w:name="_fp7fl0fj6nni" w:colFirst="0" w:colLast="0"/>
-      <w:bookmarkEnd w:id="13"/>
       <w:r>
         <w:rPr>
           <w:color w:val="3A3A3A"/>
@@ -47550,6 +47302,7 @@
           </w:tcPr>
           <w:p>
             <w:r>
+              <w:lastRenderedPageBreak/>
               <w:t>3</w:t>
             </w:r>
           </w:p>
@@ -47707,8 +47460,6 @@
           <w:szCs w:val="26"/>
         </w:rPr>
       </w:pPr>
-      <w:bookmarkStart w:id="13" w:name="_fp7fl0fj6nni" w:colFirst="0" w:colLast="0"/>
-      <w:bookmarkEnd w:id="13"/>
       <w:r>
         <w:rPr>
           <w:color w:val="3A3A3A"/>
@@ -47902,6 +47653,7 @@
                 <w:sz w:val="20"/>
                 <w:szCs w:val="20"/>
               </w:rPr>
+              <w:lastRenderedPageBreak/>
               <w:t>Score</w:t>
             </w:r>
           </w:p>
@@ -48229,8 +47981,6 @@
           <w:szCs w:val="26"/>
         </w:rPr>
       </w:pPr>
-      <w:bookmarkStart w:id="13" w:name="_fp7fl0fj6nni" w:colFirst="0" w:colLast="0"/>
-      <w:bookmarkEnd w:id="13"/>
       <w:r>
         <w:rPr>
           <w:color w:val="3A3A3A"/>
@@ -48345,6 +48095,7 @@
           <w:sz w:val="20"/>
           <w:szCs w:val="20"/>
         </w:rPr>
+        <w:lastRenderedPageBreak/>
         <w:t>Anderson, L.W. &amp; Krathwohl, D.R. (2001). A Taxonomy for Learning, Teaching, and Assessing. Longman.</w:t>
       </w:r>
     </w:p>
@@ -48787,14 +48538,13 @@
           <w:szCs w:val="26"/>
         </w:rPr>
       </w:pPr>
-      <w:bookmarkStart w:id="13" w:name="_fp7fl0fj6nni" w:colFirst="0" w:colLast="0"/>
-      <w:bookmarkEnd w:id="13"/>
       <w:r>
         <w:rPr>
           <w:color w:val="3A3A3A"/>
           <w:sz w:val="26"/>
           <w:szCs w:val="26"/>
         </w:rPr>
+        <w:lastRenderedPageBreak/>
         <w:t>Dimension 4: Coverage Completeness</w:t>
       </w:r>
     </w:p>
@@ -49296,6 +49046,7 @@
           <w:sz w:val="20"/>
           <w:szCs w:val="20"/>
         </w:rPr>
+        <w:lastRenderedPageBreak/>
         <w:t xml:space="preserve"> </w:t>
       </w:r>
     </w:p>
@@ -49309,8 +49060,6 @@
           <w:szCs w:val="26"/>
         </w:rPr>
       </w:pPr>
-      <w:bookmarkStart w:id="13" w:name="_fp7fl0fj6nni" w:colFirst="0" w:colLast="0"/>
-      <w:bookmarkEnd w:id="13"/>
       <w:r>
         <w:rPr>
           <w:color w:val="3A3A3A"/>
@@ -49725,6 +49474,7 @@
           </w:tcPr>
           <w:p>
             <w:r>
+              <w:lastRenderedPageBreak/>
               <w:t>2</w:t>
             </w:r>
           </w:p>
@@ -49831,8 +49581,8 @@
           <w:szCs w:val="26"/>
         </w:rPr>
       </w:pPr>
-      <w:bookmarkStart w:id="13" w:name="_fp7fl0fj6nni" w:colFirst="0" w:colLast="0"/>
-      <w:bookmarkEnd w:id="13"/>
+      <w:bookmarkStart w:id="76" w:name="_fp7fl0fj6nni" w:colFirst="0" w:colLast="0"/>
+      <w:bookmarkEnd w:id="76"/>
       <w:r>
         <w:rPr>
           <w:color w:val="3A3A3A"/>
@@ -49857,7 +49607,30 @@
           <w:sz w:val="20"/>
           <w:szCs w:val="20"/>
         </w:rPr>
-        <w:t>Theoretical Foundation: Hirumi, Ratliff &amp; de la Mora (2021) discipline-scope alignment in Figure 1; Hirumi (2025) three-alignments mapping; competency-based education traditions (IBSTPI, ATD, Quality Matters)</w:t>
+        <w:t xml:space="preserve">Theoretical Foundation: </w:t>
+      </w:r>
+      <w:r>
+        <w:rPr>
+          <w:sz w:val="20"/>
+          <w:szCs w:val="20"/>
+        </w:rPr>
+        <w:t>Hirumi, Ratliff &amp; de la Mora (2021) discipline-scope alignment in Figure 1; Hirumi (2025) three-alignments mapping; competency-based education traditions (IBSTPI, ATD, Quality Matters)</w:t>
+      </w:r>
+    </w:p>
+    <w:p>
+      <w:pPr>
+        <w:spacing w:before="240" w:after="120" w:line="319" w:lineRule="auto"/>
+        <w:rPr>
+          <w:sz w:val="20"/>
+          <w:szCs w:val="20"/>
+        </w:rPr>
+      </w:pPr>
+      <w:r>
+        <w:rPr>
+          <w:sz w:val="20"/>
+          <w:szCs w:val="20"/>
+        </w:rPr>
+        <w:t>Does the course or program ladder up to professional competencies, knowledge base, or accrediting examinations? Every objective at the unit/lesson level maps upward to a competency at the discipline level. For artifacts not intended to ladder up to a discipline (e.g., one-off workshops, internal training), score on internal coherence with stated purpose and note the adaptation in rationale.</w:t>
       </w:r>
     </w:p>
     <w:p>
@@ -49875,7 +49648,55 @@
           <w:sz w:val="20"/>
           <w:szCs w:val="20"/>
         </w:rPr>
-        <w:t>Does the course or program ladder up to professional competencies, knowledge base, or accrediting examinations? Every objective at the unit/lesson level maps upward to a competency at the discipline level. For artifacts not intended to ladder up to a discipline (e.g., one-off workshops, internal training), score on internal coherence with stated purpose and note the adaptation in rationale.</w:t>
+        <w:t>Source Materials:</w:t>
+      </w:r>
+    </w:p>
+    <w:p>
+      <w:pPr>
+        <w:spacing w:before="240" w:after="120" w:line="319" w:lineRule="auto"/>
+        <w:rPr>
+          <w:sz w:val="20"/>
+          <w:szCs w:val="20"/>
+        </w:rPr>
+      </w:pPr>
+      <w:r>
+        <w:rPr>
+          <w:sz w:val="20"/>
+          <w:szCs w:val="20"/>
+        </w:rPr>
+        <w:t>Hirumi, A., Ratliff, M., &amp; de la Mora Velasco, E. (2021). Analyzing your context to improve and innovate distance learning. In L. Cifuentes (Ed.), Guide to Administering Distance Learning. Brill.</w:t>
+      </w:r>
+    </w:p>
+    <w:p>
+      <w:pPr>
+        <w:spacing w:before="240" w:after="120" w:line="319" w:lineRule="auto"/>
+        <w:rPr>
+          <w:sz w:val="20"/>
+          <w:szCs w:val="20"/>
+        </w:rPr>
+      </w:pPr>
+      <w:r>
+        <w:rPr>
+          <w:sz w:val="20"/>
+          <w:szCs w:val="20"/>
+        </w:rPr>
+        <w:t>Hirumi, A. (2025). Design Principles, Ethics, and Evidence-Informed Decision Making. In R.E. West &amp; H. Leary (Eds.), Foundations of Learning and Instructional Design Technology (2nd ed., pp. 433-448). EdTechBooks.</w:t>
+      </w:r>
+    </w:p>
+    <w:p>
+      <w:pPr>
+        <w:spacing w:before="2400" w:after="240" w:line="319" w:lineRule="auto"/>
+        <w:rPr>
+          <w:sz w:val="20"/>
+          <w:szCs w:val="20"/>
+        </w:rPr>
+      </w:pPr>
+      <w:r>
+        <w:rPr>
+          <w:sz w:val="20"/>
+          <w:szCs w:val="20"/>
+        </w:rPr>
+        <w:t xml:space="preserve"> </w:t>
       </w:r>
     </w:p>
     <w:p>
@@ -49893,76 +49714,7 @@
           <w:sz w:val="20"/>
           <w:szCs w:val="20"/>
         </w:rPr>
-        <w:t>Source Materials:</w:t>
-      </w:r>
-    </w:p>
-    <w:p>
-      <w:pPr>
-        <w:spacing w:before="240" w:after="120" w:line="319" w:lineRule="auto"/>
-        <w:rPr>
-          <w:sz w:val="20"/>
-          <w:szCs w:val="20"/>
-        </w:rPr>
-      </w:pPr>
-      <w:r>
-        <w:rPr>
-          <w:b/>
-          <w:bCs/>
-          <w:sz w:val="20"/>
-          <w:szCs w:val="20"/>
-        </w:rPr>
-        <w:t>Hirumi, A., Ratliff, M., &amp; de la Mora Velasco, E. (2021). Analyzing your context to improve and innovate distance learning. In L. Cifuentes (Ed.), Guide to Administering Distance Learning. Brill.</w:t>
-      </w:r>
-    </w:p>
-    <w:p>
-      <w:pPr>
-        <w:spacing w:before="240" w:after="120" w:line="319" w:lineRule="auto"/>
-        <w:rPr>
-          <w:sz w:val="20"/>
-          <w:szCs w:val="20"/>
-        </w:rPr>
-      </w:pPr>
-      <w:r>
-        <w:rPr>
-          <w:b/>
-          <w:bCs/>
-          <w:sz w:val="20"/>
-          <w:szCs w:val="20"/>
-        </w:rPr>
-        <w:t>Hirumi, A. (2025). Design Principles, Ethics, and Evidence-Informed Decision Making. In R.E. West &amp; H. Leary (Eds.), Foundations of Learning and Instructional Design Technology (2nd ed., pp. 433-448). EdTechBooks.</w:t>
-      </w:r>
-    </w:p>
-    <w:p>
-      <w:pPr>
-        <w:spacing w:before="2400" w:after="240" w:line="319" w:lineRule="auto"/>
-        <w:rPr>
-          <w:sz w:val="20"/>
-          <w:szCs w:val="20"/>
-        </w:rPr>
-      </w:pPr>
-      <w:r>
-        <w:rPr>
-          <w:sz w:val="20"/>
-          <w:szCs w:val="20"/>
-        </w:rPr>
-        <w:t xml:space="preserve"> </w:t>
-      </w:r>
-    </w:p>
-    <w:p>
-      <w:pPr>
-        <w:spacing w:before="240" w:after="120" w:line="319" w:lineRule="auto"/>
-        <w:rPr>
-          <w:sz w:val="20"/>
-          <w:szCs w:val="20"/>
-        </w:rPr>
-      </w:pPr>
-      <w:r>
-        <w:rPr>
-          <w:b/>
-          <w:bCs/>
-          <w:sz w:val="20"/>
-          <w:szCs w:val="20"/>
-        </w:rPr>
+        <w:lastRenderedPageBreak/>
         <w:t>Scoring Criteria:</w:t>
       </w:r>
     </w:p>
@@ -50404,15 +50156,13 @@
         </w:rPr>
         <w:t xml:space="preserve">High priority - problems that significantly impair </w:t>
       </w:r>
-      <w:proofErr w:type="gramStart"/>
-      <w:r>
-        <w:rPr>
-          <w:sz w:val="20"/>
-          <w:szCs w:val="20"/>
-        </w:rPr>
-        <w:t>the instructional</w:t>
-      </w:r>
-      <w:proofErr w:type="gramEnd"/>
+      <w:r>
+        <w:rPr>
+          <w:sz w:val="20"/>
+          <w:szCs w:val="20"/>
+        </w:rPr>
+        <w:t>instructional</w:t>
+      </w:r>
       <w:r>
         <w:rPr>
           <w:sz w:val="20"/>
@@ -50463,6 +50213,7 @@
           <w:sz w:val="20"/>
           <w:szCs w:val="20"/>
         </w:rPr>
+        <w:lastRenderedPageBreak/>
         <w:t>Source: Nielsen, J. (1994). Severity Ratings for Usability Problems. Nielsen Norman Group.</w:t>
       </w:r>
     </w:p>
@@ -50484,7 +50235,6 @@
           <w:sz w:val="46"/>
           <w:szCs w:val="46"/>
         </w:rPr>
-        <w:lastRenderedPageBreak/>
         <w:t>Cross-Archetype Coverage Matrix</w:t>
       </w:r>
     </w:p>
@@ -50948,7 +50698,7 @@
       </w:tr>
       <w:tr>
         <w:trPr>
-          <w:trHeight w:val="420"/>
+          <w:trHeight w:val="617"/>
         </w:trPr>
         <w:tc>
           <w:tcPr>
@@ -54589,6 +54339,7 @@
                 <w:sz w:val="16"/>
                 <w:szCs w:val="16"/>
               </w:rPr>
+              <w:lastRenderedPageBreak/>
               <w:t>WCAG 2.1 / POUR (W3C, 2018)</w:t>
             </w:r>
           </w:p>
@@ -54952,7 +54703,6 @@
                 <w:sz w:val="16"/>
                 <w:szCs w:val="16"/>
               </w:rPr>
-              <w:lastRenderedPageBreak/>
               <w:t>UDL (CAST, 2018)</w:t>
             </w:r>
           </w:p>
@@ -56709,7 +56459,7 @@
       </w:tr>
       <w:tr>
         <w:trPr>
-          <w:trHeight w:val="420"/>
+          <w:trHeight w:val="707"/>
         </w:trPr>
         <w:tc>
           <w:tcPr>
@@ -59089,8 +58839,6 @@
         </w:rPr>
         <w:t xml:space="preserve"> </w:t>
       </w:r>
-      <w:proofErr w:type="spellStart"/>
-      <w:proofErr w:type="spellEnd"/>
     </w:p>
     <w:p>
       <w:pPr>
@@ -59108,8 +58856,6 @@
         </w:rPr>
         <w:t>References added in v3.1.0 - v3.1.2:</w:t>
       </w:r>
-      <w:proofErr w:type="spellStart"/>
-      <w:proofErr w:type="spellEnd"/>
     </w:p>
     <w:p>
       <w:pPr>
@@ -59127,8 +58873,6 @@
         </w:rPr>
         <w:t>Tyler, R.W. (1949). Basic Principles of Curriculum and Instruction. University of Chicago Press.</w:t>
       </w:r>
-      <w:proofErr w:type="spellStart"/>
-      <w:proofErr w:type="spellEnd"/>
     </w:p>
     <w:p>
       <w:pPr>
@@ -59146,8 +58890,6 @@
         </w:rPr>
         <w:t>Anderson, L.W. &amp; Krathwohl, D.R. (Eds.) (2001). A Taxonomy for Learning, Teaching, and Assessing: A Revision of Bloom's Taxonomy of Educational Objectives. Longman.</w:t>
       </w:r>
-      <w:proofErr w:type="spellStart"/>
-      <w:proofErr w:type="spellEnd"/>
     </w:p>
     <w:p>
       <w:pPr>
@@ -59165,8 +58907,6 @@
         </w:rPr>
         <w:t>Webb, N.L. (1997). Criteria for alignment of expectations and assessments in mathematics and science education. CCSSO Research Monograph No. 6.</w:t>
       </w:r>
-      <w:proofErr w:type="spellStart"/>
-      <w:proofErr w:type="spellEnd"/>
     </w:p>
     <w:p>
       <w:pPr>
@@ -59184,8 +58924,6 @@
         </w:rPr>
         <w:t>Wiggins, G., &amp; McTighe, J. (2005). Understanding by Design (2nd ed.). ASCD.</w:t>
       </w:r>
-      <w:proofErr w:type="spellStart"/>
-      <w:proofErr w:type="spellEnd"/>
     </w:p>
     <w:p>
       <w:pPr>
@@ -59203,8 +58941,6 @@
         </w:rPr>
         <w:t>Reigeluth, C.M. (1999). Instructional-Design Theories and Models, Volume II: A New Paradigm of Instructional Theory. Lawrence Erlbaum.</w:t>
       </w:r>
-      <w:proofErr w:type="spellStart"/>
-      <w:proofErr w:type="spellEnd"/>
     </w:p>
     <w:p>
       <w:pPr>
@@ -59222,8 +58958,6 @@
         </w:rPr>
         <w:t>van Merrienboer, J.J.G., &amp; Kirschner, P.A. (2018). Ten Steps to Complex Learning (3rd ed.). Routledge.</w:t>
       </w:r>
-      <w:proofErr w:type="spellStart"/>
-      <w:proofErr w:type="spellEnd"/>
     </w:p>
     <w:p>
       <w:pPr>
@@ -59241,8 +58975,6 @@
         </w:rPr>
         <w:t>Merrill, M.D. (2002). First principles of instruction. Educational Technology Research and Development, 50(3), 43-59.</w:t>
       </w:r>
-      <w:proofErr w:type="spellStart"/>
-      <w:proofErr w:type="spellEnd"/>
     </w:p>
     <w:p>
       <w:pPr>
@@ -59260,8 +58992,6 @@
         </w:rPr>
         <w:t>Keller, J.M. (1987). Development and Use of the ARCS Model of Instructional Design. Journal of Instructional Development, 10(3), 2-10.</w:t>
       </w:r>
-      <w:proofErr w:type="spellStart"/>
-      <w:proofErr w:type="spellEnd"/>
     </w:p>
     <w:p>
       <w:pPr>
@@ -59279,8 +59009,6 @@
         </w:rPr>
         <w:t>Keller, J.M. (2010). Motivational Design for Learning and Performance: The ARCS Model Approach. Springer.</w:t>
       </w:r>
-      <w:proofErr w:type="spellStart"/>
-      <w:proofErr w:type="spellEnd"/>
     </w:p>
     <w:p>
       <w:pPr>
@@ -59298,8 +59026,6 @@
         </w:rPr>
         <w:t>Hannafin, M.J., Hannafin, K.M., Land, S.M., &amp; Oliver, K. (1997). Grounded practice and the design of constructivist learning environments. Educational Technology Research and Development, 45(3), 101-117.</w:t>
       </w:r>
-      <w:proofErr w:type="spellStart"/>
-      <w:proofErr w:type="spellEnd"/>
     </w:p>
     <w:p>
       <w:pPr>
@@ -59317,8 +59043,6 @@
         </w:rPr>
         <w:t>Hirumi, A., Ratliff, M., &amp; de la Mora Velasco, E. (2021). Analyzing your context to improve and innovate distance learning (pp. 104-140). In L. Cifuentes (Ed.), Guide to Administering Distance Learning. Brill Publishing.</w:t>
       </w:r>
-      <w:proofErr w:type="spellStart"/>
-      <w:proofErr w:type="spellEnd"/>
     </w:p>
     <w:p>
       <w:pPr>
@@ -59334,10 +59058,24 @@
           <w:sz w:val="20"/>
           <w:szCs w:val="20"/>
         </w:rPr>
-        <w:t>Hirumi, A. (2025). Design Principles, Ethics, and Evidence-Informed Decision Making: The (Evolving) Future of the Field is Design! In R.E. West &amp; H. Leary (Eds.), Foundations of Learning and Instructional Design Technology (2nd ed., pp. 244-254 and 433-448). EdTechBooks.</w:t>
+        <w:t xml:space="preserve">Hirumi, A. (2025). Design Principles, Ethics, and Evidence-Informed Decision Making: The (Evolving) Future of the Field is Design! In R.E. West &amp; H. Leary (Eds.), Foundations of Learning and Instructional Design Technology (2nd ed., pp. 244-254 and 433-448). </w:t>
       </w:r>
       <w:proofErr w:type="spellStart"/>
+      <w:r>
+        <w:rPr>
+          <w:sz w:val="20"/>
+          <w:szCs w:val="20"/>
+        </w:rPr>
+        <w:t>EdTechBooks</w:t>
+      </w:r>
       <w:proofErr w:type="spellEnd"/>
+      <w:r>
+        <w:rPr>
+          <w:sz w:val="20"/>
+          <w:szCs w:val="20"/>
+        </w:rPr>
+        <w:t>.</w:t>
+      </w:r>
     </w:p>
     <w:p>
       <w:pPr>
@@ -59496,6 +59234,119 @@
 <file path=word/numbering.xml><?xml version="1.0" encoding="utf-8"?>
 <w:numbering xmlns:wpc="http://schemas.microsoft.com/office/word/2010/wordprocessingCanvas" xmlns:cx="http://schemas.microsoft.com/office/drawing/2014/chartex" xmlns:cx1="http://schemas.microsoft.com/office/drawing/2015/9/8/chartex" xmlns:cx2="http://schemas.microsoft.com/office/drawing/2015/10/21/chartex" xmlns:cx3="http://schemas.microsoft.com/office/drawing/2016/5/9/chartex" xmlns:cx4="http://schemas.microsoft.com/office/drawing/2016/5/10/chartex" xmlns:cx5="http://schemas.microsoft.com/office/drawing/2016/5/11/chartex" xmlns:cx6="http://schemas.microsoft.com/office/drawing/2016/5/12/chartex" xmlns:cx7="http://schemas.microsoft.com/office/drawing/2016/5/13/chartex" xmlns:cx8="http://schemas.microsoft.com/office/drawing/2016/5/14/chartex" xmlns:mc="http://schemas.openxmlformats.org/markup-compatibility/2006" xmlns:aink="http://schemas.microsoft.com/office/drawing/2016/ink" xmlns:am3d="http://schemas.microsoft.com/office/drawing/2017/model3d" xmlns:o="urn:schemas-microsoft-com:office:office" xmlns:oel="http://schemas.microsoft.com/office/2019/extlst" xmlns:r="http://schemas.openxmlformats.org/officeDocument/2006/relationships" xmlns:m="http://schemas.openxmlformats.org/officeDocument/2006/math" xmlns:v="urn:schemas-microsoft-com:vml" xmlns:wp14="http://schemas.microsoft.com/office/word/2010/wordprocessingDrawing" xmlns:wp="http://schemas.openxmlformats.org/drawingml/2006/wordprocessingDrawing" xmlns:w10="urn:schemas-microsoft-com:office:word" xmlns:w="http://schemas.openxmlformats.org/wordprocessingml/2006/main" xmlns:w14="http://schemas.microsoft.com/office/word/2010/wordml" xmlns:w15="http://schemas.microsoft.com/office/word/2012/wordml" xmlns:w16cex="http://schemas.microsoft.com/office/word/2018/wordml/cex" xmlns:w16cid="http://schemas.microsoft.com/office/word/2016/wordml/cid" xmlns:w16="http://schemas.microsoft.com/office/word/2018/wordml" xmlns:w16du="http://schemas.microsoft.com/office/word/2023/wordml/word16du" xmlns:w16sdtdh="http://schemas.microsoft.com/office/word/2020/wordml/sdtdatahash" xmlns:w16sdtfl="http://schemas.microsoft.com/office/word/2024/wordml/sdtformatlock" xmlns:w16se="http://schemas.microsoft.com/office/word/2015/wordml/symex" xmlns:wpg="http://schemas.microsoft.com/office/word/2010/wordprocessingGroup" xmlns:wpi="http://schemas.microsoft.com/office/word/2010/wordprocessingInk" xmlns:wne="http://schemas.microsoft.com/office/word/2006/wordml" xmlns:wps="http://schemas.microsoft.com/office/word/2010/wordprocessingShape" mc:Ignorable="w14 w15 w16se w16cid w16 w16cex w16sdtdh w16sdtfl w16du wp14">
   <w:abstractNum w:abstractNumId="0" w15:restartNumberingAfterBreak="0">
+    <w:nsid w:val="33AE5A09"/>
+    <w:multiLevelType w:val="hybridMultilevel"/>
+    <w:tmpl w:val="B33695AC"/>
+    <w:lvl w:ilvl="0" w:tplc="04090001">
+      <w:start w:val="1"/>
+      <w:numFmt w:val="bullet"/>
+      <w:lvlText w:val=""/>
+      <w:lvlJc w:val="left"/>
+      <w:pPr>
+        <w:ind w:left="720" w:hanging="360"/>
+      </w:pPr>
+      <w:rPr>
+        <w:rFonts w:ascii="Symbol" w:hAnsi="Symbol" w:hint="default"/>
+      </w:rPr>
+    </w:lvl>
+    <w:lvl w:ilvl="1" w:tplc="04090003" w:tentative="1">
+      <w:start w:val="1"/>
+      <w:numFmt w:val="bullet"/>
+      <w:lvlText w:val="o"/>
+      <w:lvlJc w:val="left"/>
+      <w:pPr>
+        <w:ind w:left="1440" w:hanging="360"/>
+      </w:pPr>
+      <w:rPr>
+        <w:rFonts w:ascii="Courier New" w:hAnsi="Courier New" w:cs="Courier New" w:hint="default"/>
+      </w:rPr>
+    </w:lvl>
+    <w:lvl w:ilvl="2" w:tplc="04090005" w:tentative="1">
+      <w:start w:val="1"/>
+      <w:numFmt w:val="bullet"/>
+      <w:lvlText w:val=""/>
+      <w:lvlJc w:val="left"/>
+      <w:pPr>
+        <w:ind w:left="2160" w:hanging="360"/>
+      </w:pPr>
+      <w:rPr>
+        <w:rFonts w:ascii="Wingdings" w:hAnsi="Wingdings" w:hint="default"/>
+      </w:rPr>
+    </w:lvl>
+    <w:lvl w:ilvl="3" w:tplc="04090001" w:tentative="1">
+      <w:start w:val="1"/>
+      <w:numFmt w:val="bullet"/>
+      <w:lvlText w:val=""/>
+      <w:lvlJc w:val="left"/>
+      <w:pPr>
+        <w:ind w:left="2880" w:hanging="360"/>
+      </w:pPr>
+      <w:rPr>
+        <w:rFonts w:ascii="Symbol" w:hAnsi="Symbol" w:hint="default"/>
+      </w:rPr>
+    </w:lvl>
+    <w:lvl w:ilvl="4" w:tplc="04090003" w:tentative="1">
+      <w:start w:val="1"/>
+      <w:numFmt w:val="bullet"/>
+      <w:lvlText w:val="o"/>
+      <w:lvlJc w:val="left"/>
+      <w:pPr>
+        <w:ind w:left="3600" w:hanging="360"/>
+      </w:pPr>
+      <w:rPr>
+        <w:rFonts w:ascii="Courier New" w:hAnsi="Courier New" w:cs="Courier New" w:hint="default"/>
+      </w:rPr>
+    </w:lvl>
+    <w:lvl w:ilvl="5" w:tplc="04090005" w:tentative="1">
+      <w:start w:val="1"/>
+      <w:numFmt w:val="bullet"/>
+      <w:lvlText w:val=""/>
+      <w:lvlJc w:val="left"/>
+      <w:pPr>
+        <w:ind w:left="4320" w:hanging="360"/>
+      </w:pPr>
+      <w:rPr>
+        <w:rFonts w:ascii="Wingdings" w:hAnsi="Wingdings" w:hint="default"/>
+      </w:rPr>
+    </w:lvl>
+    <w:lvl w:ilvl="6" w:tplc="04090001" w:tentative="1">
+      <w:start w:val="1"/>
+      <w:numFmt w:val="bullet"/>
+      <w:lvlText w:val=""/>
+      <w:lvlJc w:val="left"/>
+      <w:pPr>
+        <w:ind w:left="5040" w:hanging="360"/>
+      </w:pPr>
+      <w:rPr>
+        <w:rFonts w:ascii="Symbol" w:hAnsi="Symbol" w:hint="default"/>
+      </w:rPr>
+    </w:lvl>
+    <w:lvl w:ilvl="7" w:tplc="04090003" w:tentative="1">
+      <w:start w:val="1"/>
+      <w:numFmt w:val="bullet"/>
+      <w:lvlText w:val="o"/>
+      <w:lvlJc w:val="left"/>
+      <w:pPr>
+        <w:ind w:left="5760" w:hanging="360"/>
+      </w:pPr>
+      <w:rPr>
+        <w:rFonts w:ascii="Courier New" w:hAnsi="Courier New" w:cs="Courier New" w:hint="default"/>
+      </w:rPr>
+    </w:lvl>
+    <w:lvl w:ilvl="8" w:tplc="04090005" w:tentative="1">
+      <w:start w:val="1"/>
+      <w:numFmt w:val="bullet"/>
+      <w:lvlText w:val=""/>
+      <w:lvlJc w:val="left"/>
+      <w:pPr>
+        <w:ind w:left="6480" w:hanging="360"/>
+      </w:pPr>
+      <w:rPr>
+        <w:rFonts w:ascii="Wingdings" w:hAnsi="Wingdings" w:hint="default"/>
+      </w:rPr>
+    </w:lvl>
+  </w:abstractNum>
+  <w:abstractNum w:abstractNumId="1" w15:restartNumberingAfterBreak="0">
     <w:nsid w:val="5C643ACE"/>
     <w:multiLevelType w:val="hybridMultilevel"/>
     <w:tmpl w:val="0B948C8C"/>
@@ -59608,6 +59459,9 @@
     </w:lvl>
   </w:abstractNum>
   <w:num w:numId="1" w16cid:durableId="928856557">
+    <w:abstractNumId w:val="1"/>
+  </w:num>
+  <w:num w:numId="2" w16cid:durableId="932131654">
     <w:abstractNumId w:val="0"/>
   </w:num>
 </w:numbering>

</xml_diff>